<commit_message>
Update Tailoring commentary - additional materials.docx
</commit_message>
<xml_diff>
--- a/Tailoring commentary - additional materials.docx
+++ b/Tailoring commentary - additional materials.docx
@@ -6,6 +6,8 @@
       <w:pPr>
         <w:pStyle w:val="Heading1"/>
       </w:pPr>
+      <w:bookmarkStart w:id="0" w:name="_Toc237263770"/>
+      <w:bookmarkStart w:id="1" w:name="_Toc237263981"/>
       <w:r>
         <w:t>Better t</w:t>
       </w:r>
@@ -15,26 +17,102 @@
       <w:r>
         <w:t xml:space="preserve"> in trials comparing treatment options in common use</w:t>
       </w:r>
+      <w:bookmarkEnd w:id="0"/>
+      <w:r>
+        <w:t xml:space="preserve">: </w:t>
+      </w:r>
+      <w:bookmarkStart w:id="2" w:name="_Toc237263771"/>
+      <w:r>
+        <w:t>Supplement</w:t>
+      </w:r>
+      <w:r>
+        <w:t>ary materials</w:t>
+      </w:r>
+      <w:bookmarkEnd w:id="1"/>
+      <w:bookmarkEnd w:id="2"/>
     </w:p>
     <w:p>
       <w:pPr>
-        <w:pStyle w:val="Heading1"/>
-      </w:pPr>
-      <w:r>
-        <w:t>Supplement</w:t>
-      </w:r>
-      <w:r>
-        <w:t>ary materials</w:t>
+        <w:pStyle w:val="Heading2"/>
+      </w:pPr>
+      <w:bookmarkStart w:id="3" w:name="_Ref169616810"/>
+      <w:bookmarkStart w:id="4" w:name="_Toc237263983"/>
+      <w:r>
+        <w:t>Contents</w:t>
       </w:r>
     </w:p>
     <w:p>
+      <w:r>
+        <w:t>Sample size calculation methods</w:t>
+      </w:r>
+    </w:p>
+    <w:p>
+      <w:pPr>
+        <w:ind w:left="720"/>
+      </w:pPr>
+      <w:r>
+        <w:t>Superiority of either of NACRT or NACT over the other</w:t>
+      </w:r>
+    </w:p>
+    <w:p>
+      <w:pPr>
+        <w:ind w:left="720"/>
+      </w:pPr>
+      <w:r>
+        <w:t>Superiority of NACRT over NACT or of NACT over NACRT</w:t>
+      </w:r>
+    </w:p>
+    <w:p>
+      <w:pPr>
+        <w:ind w:left="720"/>
+      </w:pPr>
+      <w:r>
+        <w:t>Non-inferiority of NACT to NACRT OR Non-inferiority of NACRT to NACT</w:t>
+      </w:r>
+    </w:p>
+    <w:p>
+      <w:pPr>
+        <w:ind w:left="720"/>
+      </w:pPr>
+      <w:r>
+        <w:t>Novel frequentist</w:t>
+      </w:r>
+    </w:p>
+    <w:p>
+      <w:pPr>
+        <w:ind w:left="720"/>
+      </w:pPr>
+      <w:r>
+        <w:t>Bayesian design (non-informative prior)</w:t>
+      </w:r>
+    </w:p>
+    <w:p>
+      <w:pPr>
+        <w:ind w:left="720"/>
+      </w:pPr>
+      <w:r>
+        <w:t>Decision-based approach</w:t>
+      </w:r>
+    </w:p>
+    <w:p>
+      <w:r>
+        <w:t>References</w:t>
+      </w:r>
+    </w:p>
+    <w:p>
+      <w:r>
+        <w:t>Table of sample sizes</w:t>
+      </w:r>
+    </w:p>
+    <w:p/>
+    <w:p>
       <w:pPr>
         <w:pStyle w:val="Heading2"/>
       </w:pPr>
-      <w:bookmarkStart w:id="0" w:name="_Ref169616810"/>
       <w:r>
         <w:t>Sample size calculation methods</w:t>
       </w:r>
+      <w:bookmarkEnd w:id="4"/>
     </w:p>
     <w:p>
       <w:r>
@@ -76,9 +154,13 @@
       <w:pPr>
         <w:pStyle w:val="Heading3"/>
       </w:pPr>
+      <w:bookmarkStart w:id="5" w:name="_Toc237263773"/>
+      <w:bookmarkStart w:id="6" w:name="_Toc237263984"/>
       <w:r>
         <w:t>Superiority of either of NACRT or NACT over the other</w:t>
       </w:r>
+      <w:bookmarkEnd w:id="5"/>
+      <w:bookmarkEnd w:id="6"/>
     </w:p>
     <w:p>
       <w:r>
@@ -203,10 +285,7 @@
         <w:fldChar w:fldCharType="begin"/>
       </w:r>
       <w:r>
-        <w:instrText xml:space="preserve"> REF _Ref236047323 \h </w:instrText>
-      </w:r>
-      <w:r>
-        <w:instrText xml:space="preserve"> \* MERGEFORMAT </w:instrText>
+        <w:instrText xml:space="preserve"> REF _Ref236047323 \h  \* MERGEFORMAT </w:instrText>
       </w:r>
       <w:r>
         <w:fldChar w:fldCharType="separate"/>
@@ -232,6 +311,8 @@
       <w:pPr>
         <w:pStyle w:val="Heading3"/>
       </w:pPr>
+      <w:bookmarkStart w:id="7" w:name="_Toc237263774"/>
+      <w:bookmarkStart w:id="8" w:name="_Toc237263985"/>
       <w:r>
         <w:t xml:space="preserve">Superiority of NACRT over NACT </w:t>
       </w:r>
@@ -241,25 +322,12 @@
       <w:r>
         <w:t xml:space="preserve"> of NACT over NACRT</w:t>
       </w:r>
+      <w:bookmarkEnd w:id="7"/>
+      <w:bookmarkEnd w:id="8"/>
     </w:p>
     <w:p>
       <w:r>
-        <w:t xml:space="preserve">This </w:t>
-      </w:r>
-      <w:r>
-        <w:t>method</w:t>
-      </w:r>
-      <w:r>
-        <w:t xml:space="preserve"> is</w:t>
-      </w:r>
-      <w:r>
-        <w:t xml:space="preserve"> not discussed in the main text, </w:t>
-      </w:r>
-      <w:r>
-        <w:t xml:space="preserve">but is </w:t>
-      </w:r>
-      <w:r>
-        <w:t>included here for completeness.</w:t>
+        <w:t>This method is not discussed in the main text, but is included here for completeness.</w:t>
       </w:r>
     </w:p>
     <w:p>
@@ -302,9 +370,13 @@
       <w:pPr>
         <w:pStyle w:val="Heading3"/>
       </w:pPr>
+      <w:bookmarkStart w:id="9" w:name="_Toc237263775"/>
+      <w:bookmarkStart w:id="10" w:name="_Toc237263986"/>
       <w:r>
         <w:t>Non-inferiority of NACT to NACRT OR Non-inferiority of NACRT to NACT</w:t>
       </w:r>
+      <w:bookmarkEnd w:id="9"/>
+      <w:bookmarkEnd w:id="10"/>
     </w:p>
     <w:p>
       <w:r>
@@ -313,6 +385,7 @@
     </w:p>
     <w:p>
       <w:r>
+        <w:lastRenderedPageBreak/>
         <w:t>The previous sample size calculation is changed to</w:t>
       </w:r>
       <w:r>
@@ -372,6 +445,8 @@
       <w:pPr>
         <w:pStyle w:val="Heading3"/>
       </w:pPr>
+      <w:bookmarkStart w:id="11" w:name="_Toc237263776"/>
+      <w:bookmarkStart w:id="12" w:name="_Toc237263987"/>
       <w:r>
         <w:t>Novel</w:t>
       </w:r>
@@ -381,6 +456,8 @@
       <w:r>
         <w:t>requentist</w:t>
       </w:r>
+      <w:bookmarkEnd w:id="11"/>
+      <w:bookmarkEnd w:id="12"/>
     </w:p>
     <w:p>
       <w:r>
@@ -426,7 +503,6 @@
         <w:pStyle w:val="Typeface"/>
       </w:pPr>
       <w:r>
-        <w:lastRenderedPageBreak/>
         <w:t>artbin, pr(</w:t>
       </w:r>
       <w:r>
@@ -451,9 +527,13 @@
       <w:pPr>
         <w:pStyle w:val="Heading3"/>
       </w:pPr>
+      <w:bookmarkStart w:id="13" w:name="_Toc237263777"/>
+      <w:bookmarkStart w:id="14" w:name="_Toc237263988"/>
       <w:r>
         <w:t>Bayesian design (non-informative prior)</w:t>
       </w:r>
+      <w:bookmarkEnd w:id="13"/>
+      <w:bookmarkEnd w:id="14"/>
     </w:p>
     <w:p>
       <w:r>
@@ -789,6 +869,7 @@
         <w:pStyle w:val="Typeface"/>
       </w:pPr>
       <w:r>
+        <w:lastRenderedPageBreak/>
         <w:t>bayespower, n1(</w:t>
       </w:r>
       <w:r>
@@ -924,11 +1005,18 @@
       <w:pPr>
         <w:pStyle w:val="Heading3"/>
       </w:pPr>
+      <w:bookmarkStart w:id="15" w:name="_Toc237263778"/>
+      <w:bookmarkStart w:id="16" w:name="_Toc237263989"/>
       <w:r>
         <w:t>Decision-based approach</w:t>
       </w:r>
+      <w:bookmarkEnd w:id="15"/>
+      <w:bookmarkEnd w:id="16"/>
     </w:p>
     <w:p>
+      <w:pPr>
+        <w:keepNext/>
+      </w:pPr>
       <w:r>
         <w:t xml:space="preserve">We use standard software for this using the following argument. </w:t>
       </w:r>
@@ -1044,7 +1132,6 @@
         </w:rPr>
       </w:pPr>
       <w:r>
-        <w:lastRenderedPageBreak/>
         <w:t xml:space="preserve">Let </w:t>
       </w:r>
       <m:oMath>
@@ -1630,10 +1717,7 @@
               <w:ind w:left="0"/>
             </w:pPr>
             <w:r>
-              <w:t>B</w:t>
-            </w:r>
-            <w:r>
-              <w:t xml:space="preserve">enefit </w:t>
+              <w:t xml:space="preserve">Benefit </w:t>
             </w:r>
             <w:r>
               <w:t>from perfect knowledge cf no data</w:t>
@@ -1756,10 +1840,7 @@
               <w:ind w:left="0"/>
             </w:pPr>
             <w:r>
-              <w:t>B</w:t>
-            </w:r>
-            <w:r>
-              <w:t xml:space="preserve">enefit </w:t>
+              <w:t xml:space="preserve">Benefit </w:t>
             </w:r>
             <w:r>
               <w:t>from trial data cf no data</w:t>
@@ -2160,19 +2241,7 @@
         <w:ind w:left="360"/>
       </w:pPr>
       <w:r>
-        <w:t xml:space="preserve">It follows that a trial with 90% power achieves an </w:t>
-      </w:r>
-      <w:r>
-        <w:t xml:space="preserve">expected health benefit </w:t>
-      </w:r>
-      <w:r>
-        <w:t xml:space="preserve">which is </w:t>
-      </w:r>
-      <w:r>
-        <w:t xml:space="preserve">80% of the </w:t>
-      </w:r>
-      <w:r>
-        <w:t>benefit from perfect data (</w:t>
+        <w:t>It follows that a trial with 90% power achieves an expected health benefit which is 80% of the benefit from perfect data (</w:t>
       </w:r>
       <m:oMath>
         <m:r>
@@ -2195,12 +2264,15 @@
     <w:p>
       <w:pPr>
         <w:pStyle w:val="ListParagraph"/>
+        <w:keepNext/>
         <w:numPr>
           <w:ilvl w:val="0"/>
           <w:numId w:val="21"/>
         </w:numPr>
-      </w:pPr>
-      <w:r>
+        <w:ind w:left="357" w:hanging="357"/>
+      </w:pPr>
+      <w:r>
+        <w:lastRenderedPageBreak/>
         <w:t xml:space="preserve">Hence </w:t>
       </w:r>
       <w:r>
@@ -2272,12 +2344,14 @@
       <w:pPr>
         <w:pStyle w:val="Heading1"/>
       </w:pPr>
+      <w:bookmarkStart w:id="17" w:name="_Toc237263990"/>
       <w:r>
         <w:t>Reference</w:t>
       </w:r>
       <w:r>
         <w:t>s</w:t>
       </w:r>
+      <w:bookmarkEnd w:id="17"/>
     </w:p>
     <w:p>
       <w:pPr>
@@ -2350,7 +2424,8 @@
       <w:pPr>
         <w:pStyle w:val="Caption"/>
       </w:pPr>
-      <w:bookmarkStart w:id="1" w:name="_Ref236047323"/>
+      <w:bookmarkStart w:id="18" w:name="_Ref236047323"/>
+      <w:bookmarkStart w:id="19" w:name="_Toc237263991"/>
       <w:r>
         <w:rPr>
           <w:b/>
@@ -2396,8 +2471,8 @@
         </w:rPr>
         <w:fldChar w:fldCharType="end"/>
       </w:r>
-      <w:bookmarkEnd w:id="0"/>
-      <w:bookmarkEnd w:id="1"/>
+      <w:bookmarkEnd w:id="3"/>
+      <w:bookmarkEnd w:id="18"/>
       <w:r>
         <w:t xml:space="preserve">. Possible trial designs for </w:t>
       </w:r>
@@ -2501,6 +2576,7 @@
       <w:r>
         <w:t>the other.</w:t>
       </w:r>
+      <w:bookmarkEnd w:id="19"/>
     </w:p>
     <w:tbl>
       <w:tblPr>
@@ -3383,418 +3459,13 @@
       <w:r>
         <w:t>should be considered as reference intervention</w:t>
       </w:r>
-      <w:bookmarkStart w:id="2" w:name="_Ref169885346"/>
+      <w:bookmarkStart w:id="20" w:name="_Ref169885346"/>
       <w:r>
         <w:t>.</w:t>
       </w:r>
-      <w:r>
-        <w:br w:type="page"/>
-      </w:r>
-    </w:p>
-    <w:bookmarkEnd w:id="2"/>
-    <w:p>
-      <w:pPr>
-        <w:pStyle w:val="Caption"/>
-        <w:sectPr>
-          <w:pgSz w:w="16838" w:h="11906" w:orient="landscape" w:code="9"/>
-          <w:pgMar w:top="1440" w:right="1440" w:bottom="1440" w:left="1440" w:header="709" w:footer="709" w:gutter="0"/>
-          <w:cols w:space="708"/>
-          <w:docGrid w:linePitch="360"/>
-        </w:sectPr>
-      </w:pPr>
-      <w:r>
-        <w:rPr>
-          <w:b/>
-          <w:bCs/>
-        </w:rPr>
-        <w:lastRenderedPageBreak/>
-        <w:t>Box</w:t>
-      </w:r>
-      <w:r>
-        <w:t xml:space="preserve">. </w:t>
-      </w:r>
-      <w:r>
-        <w:t>Factors making</w:t>
-      </w:r>
-      <w:r>
-        <w:t xml:space="preserve"> the proposed </w:t>
-      </w:r>
-      <w:r>
-        <w:t>approach</w:t>
-      </w:r>
-      <w:r>
-        <w:t xml:space="preserve">es </w:t>
-      </w:r>
-      <w:r>
-        <w:t>more or less appropriate than a standard approach</w:t>
-      </w:r>
-      <w:bookmarkStart w:id="3" w:name="_Ref169884017"/>
-      <w:r>
-        <w:t>.</w:t>
-      </w:r>
-    </w:p>
-    <w:tbl>
-      <w:tblPr>
-        <w:tblStyle w:val="TableGrid"/>
-        <w:tblW w:w="0" w:type="auto"/>
-        <w:tblLook w:val="04A0" w:firstRow="1" w:lastRow="0" w:firstColumn="1" w:lastColumn="0" w:noHBand="0" w:noVBand="1"/>
-      </w:tblPr>
-      <w:tblGrid>
-        <w:gridCol w:w="6974"/>
-        <w:gridCol w:w="6974"/>
-      </w:tblGrid>
-      <w:tr>
-        <w:trPr>
-          <w:trHeight w:val="176"/>
-        </w:trPr>
-        <w:tc>
-          <w:tcPr>
-            <w:tcW w:w="6974" w:type="dxa"/>
-            <w:shd w:val="clear" w:color="auto" w:fill="D9D9D9" w:themeFill="background1" w:themeFillShade="D9"/>
-          </w:tcPr>
-          <w:p>
-            <w:pPr>
-              <w:rPr>
-                <w:b/>
-              </w:rPr>
-            </w:pPr>
-            <w:r>
-              <w:rPr>
-                <w:b/>
-              </w:rPr>
-              <w:t>Making the p</w:t>
-            </w:r>
-            <w:r>
-              <w:rPr>
-                <w:b/>
-              </w:rPr>
-              <w:t>roposed approach</w:t>
-            </w:r>
-            <w:r>
-              <w:rPr>
-                <w:b/>
-              </w:rPr>
-              <w:t>es</w:t>
-            </w:r>
-            <w:r>
-              <w:rPr>
-                <w:b/>
-              </w:rPr>
-              <w:t xml:space="preserve"> more appropriate</w:t>
-            </w:r>
-          </w:p>
-        </w:tc>
-        <w:tc>
-          <w:tcPr>
-            <w:tcW w:w="6974" w:type="dxa"/>
-            <w:shd w:val="clear" w:color="auto" w:fill="D9D9D9" w:themeFill="background1" w:themeFillShade="D9"/>
-          </w:tcPr>
-          <w:p>
-            <w:pPr>
-              <w:rPr>
-                <w:b/>
-              </w:rPr>
-            </w:pPr>
-            <w:r>
-              <w:rPr>
-                <w:b/>
-              </w:rPr>
-              <w:t>Making the p</w:t>
-            </w:r>
-            <w:r>
-              <w:rPr>
-                <w:b/>
-              </w:rPr>
-              <w:t>roposed approach</w:t>
-            </w:r>
-            <w:r>
-              <w:rPr>
-                <w:b/>
-              </w:rPr>
-              <w:t xml:space="preserve">es </w:t>
-            </w:r>
-            <w:r>
-              <w:rPr>
-                <w:b/>
-              </w:rPr>
-              <w:t>less appropriate</w:t>
-            </w:r>
-          </w:p>
-        </w:tc>
-      </w:tr>
-      <w:tr>
-        <w:trPr>
-          <w:trHeight w:val="175"/>
-        </w:trPr>
-        <w:tc>
-          <w:tcPr>
-            <w:tcW w:w="6974" w:type="dxa"/>
-          </w:tcPr>
-          <w:p>
-            <w:r>
-              <w:t>I</w:t>
-            </w:r>
-            <w:r>
-              <w:t xml:space="preserve">nterventions </w:t>
-            </w:r>
-            <w:r>
-              <w:t xml:space="preserve">to be compared </w:t>
-            </w:r>
-            <w:r>
-              <w:t xml:space="preserve">are in widespread use and the expectation is that most may be </w:t>
-            </w:r>
-            <w:r>
-              <w:t xml:space="preserve">broadly </w:t>
-            </w:r>
-            <w:r>
-              <w:t>similar in terms of effectiveness</w:t>
-            </w:r>
-            <w:r>
-              <w:t xml:space="preserve"> and safety</w:t>
-            </w:r>
-            <w:r>
-              <w:t>: for example, in choice of antibiotics</w:t>
-            </w:r>
-            <w:r>
-              <w:t>.</w:t>
-            </w:r>
-          </w:p>
-          <w:p>
-            <w:r>
-              <w:t xml:space="preserve">Wide use of the </w:t>
-            </w:r>
-            <w:r>
-              <w:t xml:space="preserve">interventions </w:t>
-            </w:r>
-            <w:r>
-              <w:t>has led to e</w:t>
-            </w:r>
-            <w:r>
-              <w:t xml:space="preserve">xtensive evidence on </w:t>
-            </w:r>
-            <w:r>
-              <w:t xml:space="preserve">their </w:t>
-            </w:r>
-            <w:r>
-              <w:t>harms</w:t>
-            </w:r>
-            <w:r>
-              <w:t xml:space="preserve">, so further trial evidence of </w:t>
-            </w:r>
-            <w:r>
-              <w:t xml:space="preserve">absolute </w:t>
-            </w:r>
-            <w:r>
-              <w:t>harms is not required</w:t>
-            </w:r>
-            <w:r>
-              <w:t>.</w:t>
-            </w:r>
-          </w:p>
-          <w:p>
-            <w:r>
-              <w:t>I</w:t>
-            </w:r>
-            <w:r>
-              <w:t xml:space="preserve">ntervention </w:t>
-            </w:r>
-            <w:r>
-              <w:t xml:space="preserve">options are in a steady state (i.e. there are no new </w:t>
-            </w:r>
-            <w:r>
-              <w:t xml:space="preserve">interventions </w:t>
-            </w:r>
-            <w:r>
-              <w:t>in ongoing trials that might improve practice) without comparative evidence</w:t>
-            </w:r>
-            <w:r>
-              <w:t>.</w:t>
-            </w:r>
-          </w:p>
-          <w:p>
-            <w:r>
-              <w:t xml:space="preserve">Intervention </w:t>
-            </w:r>
-            <w:r>
-              <w:t xml:space="preserve">options are in a steady state </w:t>
-            </w:r>
-            <w:r>
-              <w:rPr>
-                <w:i/>
-                <w:iCs/>
-              </w:rPr>
-              <w:t>with</w:t>
-            </w:r>
-            <w:r>
-              <w:t xml:space="preserve"> comparative evidence, but the disease spectrum is changing, for example due to antimicrobial resistance</w:t>
-            </w:r>
-            <w:r>
-              <w:t>.</w:t>
-            </w:r>
-          </w:p>
-          <w:p>
-            <w:r>
-              <w:t xml:space="preserve">Evidence comparing existing </w:t>
-            </w:r>
-            <w:r>
-              <w:t xml:space="preserve">interventions </w:t>
-            </w:r>
-            <w:r>
-              <w:t xml:space="preserve">(directly or indirectly) is absent, or there are concerns about bias or validity of indirect evidence. </w:t>
-            </w:r>
-          </w:p>
-          <w:p>
-            <w:r>
-              <w:t>More than two interventions are to be compared</w:t>
-            </w:r>
-            <w:r>
-              <w:t>.</w:t>
-            </w:r>
-          </w:p>
-        </w:tc>
-        <w:tc>
-          <w:tcPr>
-            <w:tcW w:w="6974" w:type="dxa"/>
-          </w:tcPr>
-          <w:p>
-            <w:r>
-              <w:t>A newly</w:t>
-            </w:r>
-            <w:r>
-              <w:t>-</w:t>
-            </w:r>
-            <w:r>
-              <w:t xml:space="preserve">licensed treatment is not (yet) in wide use, e.g. </w:t>
-            </w:r>
-            <w:r>
-              <w:t xml:space="preserve">GLP-1 inhibitors </w:t>
-            </w:r>
-            <w:r>
-              <w:t>(</w:t>
-            </w:r>
-            <w:r>
-              <w:t>terzepatide</w:t>
-            </w:r>
-            <w:r>
-              <w:t>).</w:t>
-            </w:r>
-          </w:p>
-          <w:p>
-            <w:r>
-              <w:t>Trial results will contribute to regulatory approval</w:t>
-            </w:r>
-            <w:r>
-              <w:t xml:space="preserve"> in that setting</w:t>
-            </w:r>
-            <w:r>
-              <w:t>.</w:t>
-            </w:r>
-          </w:p>
-          <w:p>
-            <w:r>
-              <w:t xml:space="preserve">In this </w:t>
-            </w:r>
-            <w:r>
-              <w:t>clinical area</w:t>
-            </w:r>
-            <w:r>
-              <w:t>,</w:t>
-            </w:r>
-            <w:r>
-              <w:t xml:space="preserve"> a single standard</w:t>
-            </w:r>
-            <w:r>
-              <w:t>-</w:t>
-            </w:r>
-            <w:r>
-              <w:t>of</w:t>
-            </w:r>
-            <w:r>
-              <w:t>-</w:t>
-            </w:r>
-            <w:r>
-              <w:t xml:space="preserve">care </w:t>
-            </w:r>
-            <w:r>
-              <w:t xml:space="preserve">is </w:t>
-            </w:r>
-            <w:r>
-              <w:t xml:space="preserve">recommended in </w:t>
-            </w:r>
-            <w:r>
-              <w:t xml:space="preserve">international </w:t>
-            </w:r>
-            <w:r>
-              <w:t>guidelines for most patients.</w:t>
-            </w:r>
-          </w:p>
-          <w:p>
-            <w:r>
-              <w:t>S</w:t>
-            </w:r>
-            <w:r>
-              <w:t xml:space="preserve">ubstantial evidence for the </w:t>
-            </w:r>
-            <w:r>
-              <w:t xml:space="preserve">effectiveness of </w:t>
-            </w:r>
-            <w:r>
-              <w:t xml:space="preserve">existing </w:t>
-            </w:r>
-            <w:r>
-              <w:t xml:space="preserve">interventions </w:t>
-            </w:r>
-            <w:r>
-              <w:t>has been used to produce indirect evidence (e.g. using network meta-analysis).</w:t>
-            </w:r>
-          </w:p>
-          <w:p>
-            <w:r>
-              <w:t xml:space="preserve">A </w:t>
-            </w:r>
-            <w:r>
-              <w:t>pragmatic</w:t>
-            </w:r>
-            <w:r>
-              <w:t>, traditional,</w:t>
-            </w:r>
-            <w:r>
-              <w:t xml:space="preserve"> </w:t>
-            </w:r>
-            <w:r>
-              <w:t xml:space="preserve">very </w:t>
-            </w:r>
-            <w:r>
-              <w:t>large low</w:t>
-            </w:r>
-            <w:r>
-              <w:t>-</w:t>
-            </w:r>
-            <w:r>
-              <w:t>cost trial is possible by embedding in clinical practice</w:t>
-            </w:r>
-            <w:r>
-              <w:t>.</w:t>
-            </w:r>
-          </w:p>
-          <w:p>
-            <w:pPr>
-              <w:rPr>
-                <w:u w:val="single"/>
-              </w:rPr>
-            </w:pPr>
-          </w:p>
-        </w:tc>
-      </w:tr>
-      <w:bookmarkEnd w:id="3"/>
-    </w:tbl>
-    <w:p>
-      <w:pPr>
-        <w:spacing w:after="160" w:line="259" w:lineRule="auto"/>
-      </w:pPr>
+      <w:bookmarkEnd w:id="20"/>
     </w:p>
     <w:sectPr>
-      <w:type w:val="continuous"/>
       <w:pgSz w:w="16838" w:h="11906" w:orient="landscape" w:code="9"/>
       <w:pgMar w:top="1440" w:right="1440" w:bottom="1440" w:left="1440" w:header="709" w:footer="709" w:gutter="0"/>
       <w:cols w:space="708"/>
@@ -7205,6 +6876,44 @@
       </w:tcPr>
     </w:tblStylePr>
   </w:style>
+  <w:style w:type="paragraph" w:styleId="TOC1">
+    <w:name w:val="toc 1"/>
+    <w:basedOn w:val="Normal"/>
+    <w:next w:val="Normal"/>
+    <w:autoRedefine/>
+    <w:uiPriority w:val="39"/>
+    <w:unhideWhenUsed/>
+    <w:rsid w:val="000860F4"/>
+    <w:pPr>
+      <w:spacing w:after="100"/>
+    </w:pPr>
+  </w:style>
+  <w:style w:type="paragraph" w:styleId="TOC2">
+    <w:name w:val="toc 2"/>
+    <w:basedOn w:val="Normal"/>
+    <w:next w:val="Normal"/>
+    <w:autoRedefine/>
+    <w:uiPriority w:val="39"/>
+    <w:unhideWhenUsed/>
+    <w:rsid w:val="000860F4"/>
+    <w:pPr>
+      <w:spacing w:after="100"/>
+      <w:ind w:left="240"/>
+    </w:pPr>
+  </w:style>
+  <w:style w:type="paragraph" w:styleId="TOC3">
+    <w:name w:val="toc 3"/>
+    <w:basedOn w:val="Normal"/>
+    <w:next w:val="Normal"/>
+    <w:autoRedefine/>
+    <w:uiPriority w:val="39"/>
+    <w:unhideWhenUsed/>
+    <w:rsid w:val="000860F4"/>
+    <w:pPr>
+      <w:spacing w:after="100"/>
+      <w:ind w:left="480"/>
+    </w:pPr>
+  </w:style>
 </w:styles>
 </file>
 

</xml_diff>

<commit_message>
copy supp materials document to readme.md
</commit_message>
<xml_diff>
--- a/Tailoring commentary - additional materials.docx
+++ b/Tailoring commentary - additional materials.docx
@@ -32,89 +32,816 @@
       <w:bookmarkEnd w:id="2"/>
     </w:p>
     <w:p>
-      <w:pPr>
-        <w:pStyle w:val="Heading2"/>
-      </w:pPr>
-      <w:bookmarkStart w:id="3" w:name="_Ref169616810"/>
-      <w:bookmarkStart w:id="4" w:name="_Toc237263983"/>
-      <w:r>
-        <w:t>Contents</w:t>
+      <w:r>
+        <w:t>This document contains supplementary materials for the commentary:</w:t>
       </w:r>
     </w:p>
     <w:p>
       <w:r>
+        <w:t xml:space="preserve">White IR </w:t>
+      </w:r>
+      <w:r>
+        <w:rPr>
+          <w:i/>
+          <w:iCs/>
+        </w:rPr>
+        <w:t>et al.</w:t>
+      </w:r>
+      <w:r>
+        <w:t xml:space="preserve"> (2026) ‘Tailoring levels of evidence in trials comparing common treatments’, </w:t>
+      </w:r>
+      <w:r>
+        <w:rPr>
+          <w:i/>
+          <w:iCs/>
+        </w:rPr>
+        <w:t>The Lancet</w:t>
+      </w:r>
+      <w:r>
+        <w:t xml:space="preserve">, </w:t>
+      </w:r>
+      <w:r>
+        <w:t>published online 12 Oct 2026</w:t>
+      </w:r>
+      <w:r>
+        <w:t xml:space="preserve">. Available at: </w:t>
+      </w:r>
+      <w:hyperlink r:id="rId8" w:history="1">
+        <w:r>
+          <w:rPr>
+            <w:rStyle w:val="Hyperlink"/>
+          </w:rPr>
+          <w:t>https://doi.org/10.1016/S0140-6736(26)01948-3</w:t>
+        </w:r>
+      </w:hyperlink>
+      <w:r>
+        <w:t>.</w:t>
+      </w:r>
+    </w:p>
+    <w:p/>
+    <w:sdt>
+      <w:sdtPr>
+        <w:rPr>
+          <w:rFonts w:asciiTheme="minorHAnsi" w:eastAsiaTheme="minorHAnsi" w:hAnsiTheme="minorHAnsi" w:cstheme="minorBidi"/>
+          <w:b w:val="0"/>
+          <w:bCs w:val="0"/>
+          <w:i w:val="0"/>
+          <w:iCs w:val="0"/>
+          <w:color w:val="auto"/>
+          <w:sz w:val="24"/>
+          <w:szCs w:val="22"/>
+          <w:lang w:val="en-GB"/>
+        </w:rPr>
+        <w:id w:val="367420874"/>
+        <w:docPartObj>
+          <w:docPartGallery w:val="Table of Contents"/>
+          <w:docPartUnique/>
+        </w:docPartObj>
+      </w:sdtPr>
+      <w:sdtEndPr>
+        <w:rPr>
+          <w:noProof/>
+        </w:rPr>
+      </w:sdtEndPr>
+      <w:sdtContent>
+        <w:p>
+          <w:pPr>
+            <w:pStyle w:val="TOCHeading"/>
+          </w:pPr>
+          <w:r>
+            <w:t xml:space="preserve">Table of </w:t>
+          </w:r>
+          <w:r>
+            <w:t>Contents</w:t>
+          </w:r>
+        </w:p>
+        <w:p>
+          <w:pPr>
+            <w:pStyle w:val="TOC1"/>
+            <w:tabs>
+              <w:tab w:val="right" w:leader="dot" w:pos="9016"/>
+            </w:tabs>
+            <w:rPr>
+              <w:rFonts w:eastAsiaTheme="minorEastAsia"/>
+              <w:noProof/>
+              <w:kern w:val="2"/>
+              <w:szCs w:val="24"/>
+              <w:lang w:eastAsia="en-GB"/>
+              <w14:ligatures w14:val="standardContextual"/>
+            </w:rPr>
+          </w:pPr>
+          <w:r>
+            <w:fldChar w:fldCharType="begin"/>
+          </w:r>
+          <w:r>
+            <w:instrText xml:space="preserve"> TOC \h \z \u \t "Heading 2,1,Heading 3,2,Caption,2" </w:instrText>
+          </w:r>
+          <w:r>
+            <w:fldChar w:fldCharType="separate"/>
+          </w:r>
+          <w:hyperlink w:anchor="_Toc243316017" w:history="1">
+            <w:r>
+              <w:rPr>
+                <w:rStyle w:val="Hyperlink"/>
+                <w:noProof/>
+              </w:rPr>
+              <w:t>Sample size calculation methods</w:t>
+            </w:r>
+            <w:r>
+              <w:rPr>
+                <w:noProof/>
+                <w:webHidden/>
+              </w:rPr>
+              <w:tab/>
+            </w:r>
+            <w:r>
+              <w:rPr>
+                <w:noProof/>
+                <w:webHidden/>
+              </w:rPr>
+              <w:fldChar w:fldCharType="begin"/>
+            </w:r>
+            <w:r>
+              <w:rPr>
+                <w:noProof/>
+                <w:webHidden/>
+              </w:rPr>
+              <w:instrText xml:space="preserve"> PAGEREF _Toc243316017 \h </w:instrText>
+            </w:r>
+            <w:r>
+              <w:rPr>
+                <w:noProof/>
+                <w:webHidden/>
+              </w:rPr>
+            </w:r>
+            <w:r>
+              <w:rPr>
+                <w:noProof/>
+                <w:webHidden/>
+              </w:rPr>
+              <w:fldChar w:fldCharType="separate"/>
+            </w:r>
+            <w:r>
+              <w:rPr>
+                <w:noProof/>
+                <w:webHidden/>
+              </w:rPr>
+              <w:t>1</w:t>
+            </w:r>
+            <w:r>
+              <w:rPr>
+                <w:noProof/>
+                <w:webHidden/>
+              </w:rPr>
+              <w:fldChar w:fldCharType="end"/>
+            </w:r>
+          </w:hyperlink>
+        </w:p>
+        <w:p>
+          <w:pPr>
+            <w:pStyle w:val="TOC2"/>
+            <w:tabs>
+              <w:tab w:val="right" w:leader="dot" w:pos="9016"/>
+            </w:tabs>
+            <w:rPr>
+              <w:rFonts w:eastAsiaTheme="minorEastAsia"/>
+              <w:noProof/>
+              <w:kern w:val="2"/>
+              <w:szCs w:val="24"/>
+              <w:lang w:eastAsia="en-GB"/>
+              <w14:ligatures w14:val="standardContextual"/>
+            </w:rPr>
+          </w:pPr>
+          <w:hyperlink w:anchor="_Toc243316018" w:history="1">
+            <w:r>
+              <w:rPr>
+                <w:rStyle w:val="Hyperlink"/>
+                <w:noProof/>
+              </w:rPr>
+              <w:t>Superiority of either of NACRT or NACT over the other</w:t>
+            </w:r>
+            <w:r>
+              <w:rPr>
+                <w:noProof/>
+                <w:webHidden/>
+              </w:rPr>
+              <w:tab/>
+            </w:r>
+            <w:r>
+              <w:rPr>
+                <w:noProof/>
+                <w:webHidden/>
+              </w:rPr>
+              <w:fldChar w:fldCharType="begin"/>
+            </w:r>
+            <w:r>
+              <w:rPr>
+                <w:noProof/>
+                <w:webHidden/>
+              </w:rPr>
+              <w:instrText xml:space="preserve"> PAGEREF _Toc243316018 \h </w:instrText>
+            </w:r>
+            <w:r>
+              <w:rPr>
+                <w:noProof/>
+                <w:webHidden/>
+              </w:rPr>
+            </w:r>
+            <w:r>
+              <w:rPr>
+                <w:noProof/>
+                <w:webHidden/>
+              </w:rPr>
+              <w:fldChar w:fldCharType="separate"/>
+            </w:r>
+            <w:r>
+              <w:rPr>
+                <w:noProof/>
+                <w:webHidden/>
+              </w:rPr>
+              <w:t>1</w:t>
+            </w:r>
+            <w:r>
+              <w:rPr>
+                <w:noProof/>
+                <w:webHidden/>
+              </w:rPr>
+              <w:fldChar w:fldCharType="end"/>
+            </w:r>
+          </w:hyperlink>
+        </w:p>
+        <w:p>
+          <w:pPr>
+            <w:pStyle w:val="TOC2"/>
+            <w:tabs>
+              <w:tab w:val="right" w:leader="dot" w:pos="9016"/>
+            </w:tabs>
+            <w:rPr>
+              <w:rFonts w:eastAsiaTheme="minorEastAsia"/>
+              <w:noProof/>
+              <w:kern w:val="2"/>
+              <w:szCs w:val="24"/>
+              <w:lang w:eastAsia="en-GB"/>
+              <w14:ligatures w14:val="standardContextual"/>
+            </w:rPr>
+          </w:pPr>
+          <w:hyperlink w:anchor="_Toc243316019" w:history="1">
+            <w:r>
+              <w:rPr>
+                <w:rStyle w:val="Hyperlink"/>
+                <w:noProof/>
+              </w:rPr>
+              <w:t>Superiority of NACRT over NACT or of NACT over NACRT</w:t>
+            </w:r>
+            <w:r>
+              <w:rPr>
+                <w:noProof/>
+                <w:webHidden/>
+              </w:rPr>
+              <w:tab/>
+            </w:r>
+            <w:r>
+              <w:rPr>
+                <w:noProof/>
+                <w:webHidden/>
+              </w:rPr>
+              <w:fldChar w:fldCharType="begin"/>
+            </w:r>
+            <w:r>
+              <w:rPr>
+                <w:noProof/>
+                <w:webHidden/>
+              </w:rPr>
+              <w:instrText xml:space="preserve"> PAGEREF _Toc243316019 \h </w:instrText>
+            </w:r>
+            <w:r>
+              <w:rPr>
+                <w:noProof/>
+                <w:webHidden/>
+              </w:rPr>
+            </w:r>
+            <w:r>
+              <w:rPr>
+                <w:noProof/>
+                <w:webHidden/>
+              </w:rPr>
+              <w:fldChar w:fldCharType="separate"/>
+            </w:r>
+            <w:r>
+              <w:rPr>
+                <w:noProof/>
+                <w:webHidden/>
+              </w:rPr>
+              <w:t>1</w:t>
+            </w:r>
+            <w:r>
+              <w:rPr>
+                <w:noProof/>
+                <w:webHidden/>
+              </w:rPr>
+              <w:fldChar w:fldCharType="end"/>
+            </w:r>
+          </w:hyperlink>
+        </w:p>
+        <w:p>
+          <w:pPr>
+            <w:pStyle w:val="TOC2"/>
+            <w:tabs>
+              <w:tab w:val="right" w:leader="dot" w:pos="9016"/>
+            </w:tabs>
+            <w:rPr>
+              <w:rFonts w:eastAsiaTheme="minorEastAsia"/>
+              <w:noProof/>
+              <w:kern w:val="2"/>
+              <w:szCs w:val="24"/>
+              <w:lang w:eastAsia="en-GB"/>
+              <w14:ligatures w14:val="standardContextual"/>
+            </w:rPr>
+          </w:pPr>
+          <w:hyperlink w:anchor="_Toc243316020" w:history="1">
+            <w:r>
+              <w:rPr>
+                <w:rStyle w:val="Hyperlink"/>
+                <w:noProof/>
+              </w:rPr>
+              <w:t>Non-inferiority of NACT to NACRT OR Non-inferiority of NACRT to NACT</w:t>
+            </w:r>
+            <w:r>
+              <w:rPr>
+                <w:noProof/>
+                <w:webHidden/>
+              </w:rPr>
+              <w:tab/>
+            </w:r>
+            <w:r>
+              <w:rPr>
+                <w:noProof/>
+                <w:webHidden/>
+              </w:rPr>
+              <w:fldChar w:fldCharType="begin"/>
+            </w:r>
+            <w:r>
+              <w:rPr>
+                <w:noProof/>
+                <w:webHidden/>
+              </w:rPr>
+              <w:instrText xml:space="preserve"> PAGEREF _Toc243316020 \h </w:instrText>
+            </w:r>
+            <w:r>
+              <w:rPr>
+                <w:noProof/>
+                <w:webHidden/>
+              </w:rPr>
+            </w:r>
+            <w:r>
+              <w:rPr>
+                <w:noProof/>
+                <w:webHidden/>
+              </w:rPr>
+              <w:fldChar w:fldCharType="separate"/>
+            </w:r>
+            <w:r>
+              <w:rPr>
+                <w:noProof/>
+                <w:webHidden/>
+              </w:rPr>
+              <w:t>1</w:t>
+            </w:r>
+            <w:r>
+              <w:rPr>
+                <w:noProof/>
+                <w:webHidden/>
+              </w:rPr>
+              <w:fldChar w:fldCharType="end"/>
+            </w:r>
+          </w:hyperlink>
+        </w:p>
+        <w:p>
+          <w:pPr>
+            <w:pStyle w:val="TOC2"/>
+            <w:tabs>
+              <w:tab w:val="right" w:leader="dot" w:pos="9016"/>
+            </w:tabs>
+            <w:rPr>
+              <w:rFonts w:eastAsiaTheme="minorEastAsia"/>
+              <w:noProof/>
+              <w:kern w:val="2"/>
+              <w:szCs w:val="24"/>
+              <w:lang w:eastAsia="en-GB"/>
+              <w14:ligatures w14:val="standardContextual"/>
+            </w:rPr>
+          </w:pPr>
+          <w:hyperlink w:anchor="_Toc243316021" w:history="1">
+            <w:r>
+              <w:rPr>
+                <w:rStyle w:val="Hyperlink"/>
+                <w:noProof/>
+              </w:rPr>
+              <w:t>Novel frequentist</w:t>
+            </w:r>
+            <w:r>
+              <w:rPr>
+                <w:noProof/>
+                <w:webHidden/>
+              </w:rPr>
+              <w:tab/>
+            </w:r>
+            <w:r>
+              <w:rPr>
+                <w:noProof/>
+                <w:webHidden/>
+              </w:rPr>
+              <w:fldChar w:fldCharType="begin"/>
+            </w:r>
+            <w:r>
+              <w:rPr>
+                <w:noProof/>
+                <w:webHidden/>
+              </w:rPr>
+              <w:instrText xml:space="preserve"> PAGEREF _Toc243316021 \h </w:instrText>
+            </w:r>
+            <w:r>
+              <w:rPr>
+                <w:noProof/>
+                <w:webHidden/>
+              </w:rPr>
+            </w:r>
+            <w:r>
+              <w:rPr>
+                <w:noProof/>
+                <w:webHidden/>
+              </w:rPr>
+              <w:fldChar w:fldCharType="separate"/>
+            </w:r>
+            <w:r>
+              <w:rPr>
+                <w:noProof/>
+                <w:webHidden/>
+              </w:rPr>
+              <w:t>1</w:t>
+            </w:r>
+            <w:r>
+              <w:rPr>
+                <w:noProof/>
+                <w:webHidden/>
+              </w:rPr>
+              <w:fldChar w:fldCharType="end"/>
+            </w:r>
+          </w:hyperlink>
+        </w:p>
+        <w:p>
+          <w:pPr>
+            <w:pStyle w:val="TOC2"/>
+            <w:tabs>
+              <w:tab w:val="right" w:leader="dot" w:pos="9016"/>
+            </w:tabs>
+            <w:rPr>
+              <w:rFonts w:eastAsiaTheme="minorEastAsia"/>
+              <w:noProof/>
+              <w:kern w:val="2"/>
+              <w:szCs w:val="24"/>
+              <w:lang w:eastAsia="en-GB"/>
+              <w14:ligatures w14:val="standardContextual"/>
+            </w:rPr>
+          </w:pPr>
+          <w:hyperlink w:anchor="_Toc243316022" w:history="1">
+            <w:r>
+              <w:rPr>
+                <w:rStyle w:val="Hyperlink"/>
+                <w:noProof/>
+              </w:rPr>
+              <w:t>Bayesian design (non-informative prior)</w:t>
+            </w:r>
+            <w:r>
+              <w:rPr>
+                <w:noProof/>
+                <w:webHidden/>
+              </w:rPr>
+              <w:tab/>
+            </w:r>
+            <w:r>
+              <w:rPr>
+                <w:noProof/>
+                <w:webHidden/>
+              </w:rPr>
+              <w:fldChar w:fldCharType="begin"/>
+            </w:r>
+            <w:r>
+              <w:rPr>
+                <w:noProof/>
+                <w:webHidden/>
+              </w:rPr>
+              <w:instrText xml:space="preserve"> PAGEREF _Toc243316022 \h </w:instrText>
+            </w:r>
+            <w:r>
+              <w:rPr>
+                <w:noProof/>
+                <w:webHidden/>
+              </w:rPr>
+            </w:r>
+            <w:r>
+              <w:rPr>
+                <w:noProof/>
+                <w:webHidden/>
+              </w:rPr>
+              <w:fldChar w:fldCharType="separate"/>
+            </w:r>
+            <w:r>
+              <w:rPr>
+                <w:noProof/>
+                <w:webHidden/>
+              </w:rPr>
+              <w:t>1</w:t>
+            </w:r>
+            <w:r>
+              <w:rPr>
+                <w:noProof/>
+                <w:webHidden/>
+              </w:rPr>
+              <w:fldChar w:fldCharType="end"/>
+            </w:r>
+          </w:hyperlink>
+        </w:p>
+        <w:p>
+          <w:pPr>
+            <w:pStyle w:val="TOC2"/>
+            <w:tabs>
+              <w:tab w:val="right" w:leader="dot" w:pos="9016"/>
+            </w:tabs>
+            <w:rPr>
+              <w:rFonts w:eastAsiaTheme="minorEastAsia"/>
+              <w:noProof/>
+              <w:kern w:val="2"/>
+              <w:szCs w:val="24"/>
+              <w:lang w:eastAsia="en-GB"/>
+              <w14:ligatures w14:val="standardContextual"/>
+            </w:rPr>
+          </w:pPr>
+          <w:hyperlink w:anchor="_Toc243316023" w:history="1">
+            <w:r>
+              <w:rPr>
+                <w:rStyle w:val="Hyperlink"/>
+                <w:noProof/>
+              </w:rPr>
+              <w:t>Decision-based approach</w:t>
+            </w:r>
+            <w:r>
+              <w:rPr>
+                <w:noProof/>
+                <w:webHidden/>
+              </w:rPr>
+              <w:tab/>
+            </w:r>
+            <w:r>
+              <w:rPr>
+                <w:noProof/>
+                <w:webHidden/>
+              </w:rPr>
+              <w:fldChar w:fldCharType="begin"/>
+            </w:r>
+            <w:r>
+              <w:rPr>
+                <w:noProof/>
+                <w:webHidden/>
+              </w:rPr>
+              <w:instrText xml:space="preserve"> PAGEREF _Toc243316023 \h </w:instrText>
+            </w:r>
+            <w:r>
+              <w:rPr>
+                <w:noProof/>
+                <w:webHidden/>
+              </w:rPr>
+            </w:r>
+            <w:r>
+              <w:rPr>
+                <w:noProof/>
+                <w:webHidden/>
+              </w:rPr>
+              <w:fldChar w:fldCharType="separate"/>
+            </w:r>
+            <w:r>
+              <w:rPr>
+                <w:noProof/>
+                <w:webHidden/>
+              </w:rPr>
+              <w:t>1</w:t>
+            </w:r>
+            <w:r>
+              <w:rPr>
+                <w:noProof/>
+                <w:webHidden/>
+              </w:rPr>
+              <w:fldChar w:fldCharType="end"/>
+            </w:r>
+          </w:hyperlink>
+        </w:p>
+        <w:p>
+          <w:pPr>
+            <w:pStyle w:val="TOC1"/>
+            <w:tabs>
+              <w:tab w:val="right" w:leader="dot" w:pos="9016"/>
+            </w:tabs>
+            <w:rPr>
+              <w:rFonts w:eastAsiaTheme="minorEastAsia"/>
+              <w:noProof/>
+              <w:kern w:val="2"/>
+              <w:szCs w:val="24"/>
+              <w:lang w:eastAsia="en-GB"/>
+              <w14:ligatures w14:val="standardContextual"/>
+            </w:rPr>
+          </w:pPr>
+          <w:hyperlink w:anchor="_Toc243316024" w:history="1">
+            <w:r>
+              <w:rPr>
+                <w:rStyle w:val="Hyperlink"/>
+                <w:noProof/>
+              </w:rPr>
+              <w:t>References</w:t>
+            </w:r>
+            <w:r>
+              <w:rPr>
+                <w:noProof/>
+                <w:webHidden/>
+              </w:rPr>
+              <w:tab/>
+            </w:r>
+            <w:r>
+              <w:rPr>
+                <w:noProof/>
+                <w:webHidden/>
+              </w:rPr>
+              <w:fldChar w:fldCharType="begin"/>
+            </w:r>
+            <w:r>
+              <w:rPr>
+                <w:noProof/>
+                <w:webHidden/>
+              </w:rPr>
+              <w:instrText xml:space="preserve"> PAGEREF _Toc243316024 \h </w:instrText>
+            </w:r>
+            <w:r>
+              <w:rPr>
+                <w:noProof/>
+                <w:webHidden/>
+              </w:rPr>
+            </w:r>
+            <w:r>
+              <w:rPr>
+                <w:noProof/>
+                <w:webHidden/>
+              </w:rPr>
+              <w:fldChar w:fldCharType="separate"/>
+            </w:r>
+            <w:r>
+              <w:rPr>
+                <w:noProof/>
+                <w:webHidden/>
+              </w:rPr>
+              <w:t>1</w:t>
+            </w:r>
+            <w:r>
+              <w:rPr>
+                <w:noProof/>
+                <w:webHidden/>
+              </w:rPr>
+              <w:fldChar w:fldCharType="end"/>
+            </w:r>
+          </w:hyperlink>
+        </w:p>
+        <w:p>
+          <w:pPr>
+            <w:pStyle w:val="TOC1"/>
+            <w:tabs>
+              <w:tab w:val="right" w:leader="dot" w:pos="9016"/>
+            </w:tabs>
+            <w:rPr>
+              <w:rFonts w:eastAsiaTheme="minorEastAsia"/>
+              <w:noProof/>
+              <w:kern w:val="2"/>
+              <w:szCs w:val="24"/>
+              <w:lang w:eastAsia="en-GB"/>
+              <w14:ligatures w14:val="standardContextual"/>
+            </w:rPr>
+          </w:pPr>
+          <w:hyperlink w:anchor="_Toc243316025" w:history="1">
+            <w:r>
+              <w:rPr>
+                <w:rStyle w:val="Hyperlink"/>
+                <w:bCs/>
+                <w:noProof/>
+              </w:rPr>
+              <w:t>Table 1</w:t>
+            </w:r>
+            <w:r>
+              <w:rPr>
+                <w:rStyle w:val="Hyperlink"/>
+                <w:noProof/>
+              </w:rPr>
+              <w:t xml:space="preserve">. Possible trial designs for comparing </w:t>
+            </w:r>
+            <w:r>
+              <w:rPr>
+                <w:rStyle w:val="Hyperlink"/>
+                <w:rFonts w:eastAsia="Times New Roman"/>
+                <w:noProof/>
+                <w:lang w:eastAsia="en-GB"/>
+              </w:rPr>
+              <w:t>neoadjuvant chemotherapy</w:t>
+            </w:r>
+            <w:r>
+              <w:rPr>
+                <w:rStyle w:val="Hyperlink"/>
+                <w:noProof/>
+              </w:rPr>
+              <w:t xml:space="preserve"> (NACT) and </w:t>
+            </w:r>
+            <w:r>
+              <w:rPr>
+                <w:rStyle w:val="Hyperlink"/>
+                <w:rFonts w:eastAsia="Times New Roman"/>
+                <w:noProof/>
+                <w:lang w:eastAsia="en-GB"/>
+              </w:rPr>
+              <w:t>neoadjuvant chemoradiotherapy</w:t>
+            </w:r>
+            <w:r>
+              <w:rPr>
+                <w:rStyle w:val="Hyperlink"/>
+                <w:noProof/>
+              </w:rPr>
+              <w:t xml:space="preserve"> (NACRT) in operable squamous oesophageal cancer.</w:t>
+            </w:r>
+            <w:r>
+              <w:rPr>
+                <w:noProof/>
+                <w:webHidden/>
+              </w:rPr>
+              <w:tab/>
+            </w:r>
+            <w:r>
+              <w:rPr>
+                <w:noProof/>
+                <w:webHidden/>
+              </w:rPr>
+              <w:fldChar w:fldCharType="begin"/>
+            </w:r>
+            <w:r>
+              <w:rPr>
+                <w:noProof/>
+                <w:webHidden/>
+              </w:rPr>
+              <w:instrText xml:space="preserve"> PAGEREF _Toc243316025 \h </w:instrText>
+            </w:r>
+            <w:r>
+              <w:rPr>
+                <w:noProof/>
+                <w:webHidden/>
+              </w:rPr>
+            </w:r>
+            <w:r>
+              <w:rPr>
+                <w:noProof/>
+                <w:webHidden/>
+              </w:rPr>
+              <w:fldChar w:fldCharType="separate"/>
+            </w:r>
+            <w:r>
+              <w:rPr>
+                <w:noProof/>
+                <w:webHidden/>
+              </w:rPr>
+              <w:t>1</w:t>
+            </w:r>
+            <w:r>
+              <w:rPr>
+                <w:noProof/>
+                <w:webHidden/>
+              </w:rPr>
+              <w:fldChar w:fldCharType="end"/>
+            </w:r>
+          </w:hyperlink>
+        </w:p>
+        <w:p>
+          <w:r>
+            <w:fldChar w:fldCharType="end"/>
+          </w:r>
+        </w:p>
+      </w:sdtContent>
+    </w:sdt>
+    <w:bookmarkStart w:id="3" w:name="_Toc237263983" w:displacedByCustomXml="prev"/>
+    <w:bookmarkStart w:id="4" w:name="_Ref169616810" w:displacedByCustomXml="prev"/>
+    <w:p>
+      <w:pPr>
+        <w:pStyle w:val="Heading2"/>
+      </w:pPr>
+      <w:bookmarkStart w:id="5" w:name="_Toc243316017"/>
+      <w:r>
         <w:t>Sample size calculation methods</w:t>
       </w:r>
+      <w:bookmarkEnd w:id="3"/>
+      <w:bookmarkEnd w:id="5"/>
     </w:p>
     <w:p>
-      <w:pPr>
-        <w:ind w:left="720"/>
-      </w:pPr>
-      <w:r>
-        <w:t>Superiority of either of NACRT or NACT over the other</w:t>
-      </w:r>
-    </w:p>
-    <w:p>
-      <w:pPr>
-        <w:ind w:left="720"/>
-      </w:pPr>
-      <w:r>
-        <w:t>Superiority of NACRT over NACT or of NACT over NACRT</w:t>
-      </w:r>
-    </w:p>
-    <w:p>
-      <w:pPr>
-        <w:ind w:left="720"/>
-      </w:pPr>
-      <w:r>
-        <w:t>Non-inferiority of NACT to NACRT OR Non-inferiority of NACRT to NACT</w:t>
-      </w:r>
-    </w:p>
-    <w:p>
-      <w:pPr>
-        <w:ind w:left="720"/>
-      </w:pPr>
-      <w:r>
-        <w:t>Novel frequentist</w:t>
-      </w:r>
-    </w:p>
-    <w:p>
-      <w:pPr>
-        <w:ind w:left="720"/>
-      </w:pPr>
-      <w:r>
-        <w:t>Bayesian design (non-informative prior)</w:t>
-      </w:r>
-    </w:p>
-    <w:p>
-      <w:pPr>
-        <w:ind w:left="720"/>
-      </w:pPr>
-      <w:r>
-        <w:t>Decision-based approach</w:t>
-      </w:r>
-    </w:p>
-    <w:p>
-      <w:r>
-        <w:t>References</w:t>
-      </w:r>
-    </w:p>
-    <w:p>
-      <w:r>
-        <w:t>Table of sample sizes</w:t>
-      </w:r>
-    </w:p>
-    <w:p/>
-    <w:p>
-      <w:pPr>
-        <w:pStyle w:val="Heading2"/>
-      </w:pPr>
-      <w:r>
-        <w:t>Sample size calculation methods</w:t>
-      </w:r>
-      <w:bookmarkEnd w:id="4"/>
-    </w:p>
-    <w:p>
       <w:r>
         <w:t xml:space="preserve">This section gives the concepts and code to compute the sample sizes. A Stata program </w:t>
       </w:r>
@@ -133,7 +860,7 @@
       <w:r>
         <w:t xml:space="preserve"> at </w:t>
       </w:r>
-      <w:hyperlink r:id="rId8" w:history="1">
+      <w:hyperlink r:id="rId9" w:history="1">
         <w:r>
           <w:rPr>
             <w:rStyle w:val="Hyperlink"/>
@@ -145,22 +872,20 @@
         <w:t>.</w:t>
       </w:r>
     </w:p>
+    <w:p/>
     <w:p>
       <w:pPr>
         <w:pStyle w:val="Heading3"/>
       </w:pPr>
-    </w:p>
-    <w:p>
-      <w:pPr>
-        <w:pStyle w:val="Heading3"/>
-      </w:pPr>
-      <w:bookmarkStart w:id="5" w:name="_Toc237263773"/>
-      <w:bookmarkStart w:id="6" w:name="_Toc237263984"/>
+      <w:bookmarkStart w:id="6" w:name="_Toc237263773"/>
+      <w:bookmarkStart w:id="7" w:name="_Toc237263984"/>
+      <w:bookmarkStart w:id="8" w:name="_Toc243316018"/>
       <w:r>
         <w:t>Superiority of either of NACRT or NACT over the other</w:t>
       </w:r>
-      <w:bookmarkEnd w:id="5"/>
       <w:bookmarkEnd w:id="6"/>
+      <w:bookmarkEnd w:id="7"/>
+      <w:bookmarkEnd w:id="8"/>
     </w:p>
     <w:p>
       <w:r>
@@ -311,8 +1036,9 @@
       <w:pPr>
         <w:pStyle w:val="Heading3"/>
       </w:pPr>
-      <w:bookmarkStart w:id="7" w:name="_Toc237263774"/>
-      <w:bookmarkStart w:id="8" w:name="_Toc237263985"/>
+      <w:bookmarkStart w:id="9" w:name="_Toc237263774"/>
+      <w:bookmarkStart w:id="10" w:name="_Toc237263985"/>
+      <w:bookmarkStart w:id="11" w:name="_Toc243316019"/>
       <w:r>
         <w:t xml:space="preserve">Superiority of NACRT over NACT </w:t>
       </w:r>
@@ -322,8 +1048,9 @@
       <w:r>
         <w:t xml:space="preserve"> of NACT over NACRT</w:t>
       </w:r>
-      <w:bookmarkEnd w:id="7"/>
-      <w:bookmarkEnd w:id="8"/>
+      <w:bookmarkEnd w:id="9"/>
+      <w:bookmarkEnd w:id="10"/>
+      <w:bookmarkEnd w:id="11"/>
     </w:p>
     <w:p>
       <w:r>
@@ -361,179 +1088,172 @@
         <w:t>) alpha(.05) onesided</w:t>
       </w:r>
     </w:p>
+    <w:p/>
     <w:p>
       <w:pPr>
         <w:pStyle w:val="Heading3"/>
       </w:pPr>
+      <w:bookmarkStart w:id="12" w:name="_Toc237263775"/>
+      <w:bookmarkStart w:id="13" w:name="_Toc237263986"/>
+      <w:bookmarkStart w:id="14" w:name="_Toc243316020"/>
+      <w:r>
+        <w:t>Non-inferiority of NACT to NACRT OR Non-inferiority of NACRT to NACT</w:t>
+      </w:r>
+      <w:bookmarkEnd w:id="12"/>
+      <w:bookmarkEnd w:id="13"/>
+      <w:bookmarkEnd w:id="14"/>
     </w:p>
     <w:p>
-      <w:pPr>
-        <w:pStyle w:val="Heading3"/>
-      </w:pPr>
-      <w:bookmarkStart w:id="9" w:name="_Toc237263775"/>
-      <w:bookmarkStart w:id="10" w:name="_Toc237263986"/>
-      <w:r>
-        <w:t>Non-inferiority of NACT to NACRT OR Non-inferiority of NACRT to NACT</w:t>
-      </w:r>
-      <w:bookmarkEnd w:id="9"/>
-      <w:bookmarkEnd w:id="10"/>
+      <w:r>
+        <w:t>This method is not discussed in the main text, but is included here for completeness.</w:t>
+      </w:r>
     </w:p>
     <w:p>
       <w:r>
-        <w:t>This method is not discussed in the main text, but is included here for completeness.</w:t>
+        <w:t>The previous sample size calculation is changed to</w:t>
+      </w:r>
+      <w:r>
+        <w:t xml:space="preserve"> give 90% power to show </w:t>
+      </w:r>
+      <w:r>
+        <w:t xml:space="preserve">statistically significant </w:t>
+      </w:r>
+      <w:r>
+        <w:t>evidence of superiority of</w:t>
+      </w:r>
+      <w:r>
+        <w:t xml:space="preserve"> </w:t>
+      </w:r>
+      <w:r>
+        <w:t xml:space="preserve">one treatment, with a non-inferiority margin </w:t>
+      </w:r>
+      <w:r>
+        <w:t xml:space="preserve">of a 5% </w:t>
+      </w:r>
+      <w:r>
+        <w:t xml:space="preserve">risk </w:t>
+      </w:r>
+      <w:r>
+        <w:t>difference</w:t>
+      </w:r>
+      <w:r>
+        <w:t>:</w:t>
       </w:r>
     </w:p>
     <w:p>
-      <w:r>
-        <w:lastRenderedPageBreak/>
-        <w:t>The previous sample size calculation is changed to</w:t>
-      </w:r>
-      <w:r>
-        <w:t xml:space="preserve"> give 90% power to show </w:t>
-      </w:r>
-      <w:r>
-        <w:t xml:space="preserve">statistically significant </w:t>
-      </w:r>
-      <w:r>
-        <w:t>evidence of superiority of</w:t>
-      </w:r>
-      <w:r>
-        <w:t xml:space="preserve"> </w:t>
-      </w:r>
-      <w:r>
-        <w:t xml:space="preserve">one treatment, with a non-inferiority margin </w:t>
-      </w:r>
-      <w:r>
-        <w:t xml:space="preserve">of a 5% </w:t>
-      </w:r>
-      <w:r>
-        <w:t xml:space="preserve">risk </w:t>
-      </w:r>
-      <w:r>
-        <w:t>difference</w:t>
-      </w:r>
-      <w:r>
-        <w:t>:</w:t>
-      </w:r>
+      <w:pPr>
+        <w:pStyle w:val="Typeface"/>
+      </w:pPr>
+      <w:r>
+        <w:t>artbin, pr(</w:t>
+      </w:r>
+      <w:r>
+        <w:t xml:space="preserve">0.50 </w:t>
+      </w:r>
+      <w:r>
+        <w:t>.5) power(</w:t>
+      </w:r>
+      <w:r>
+        <w:t>0.90</w:t>
+      </w:r>
+      <w:r>
+        <w:t>) margin(-.05) onesided</w:t>
+      </w:r>
+    </w:p>
+    <w:p/>
+    <w:p>
+      <w:pPr>
+        <w:pStyle w:val="Heading3"/>
+      </w:pPr>
+      <w:bookmarkStart w:id="15" w:name="_Toc237263776"/>
+      <w:bookmarkStart w:id="16" w:name="_Toc237263987"/>
+      <w:bookmarkStart w:id="17" w:name="_Toc243316021"/>
+      <w:r>
+        <w:t>Novel</w:t>
+      </w:r>
+      <w:r>
+        <w:t xml:space="preserve"> f</w:t>
+      </w:r>
+      <w:r>
+        <w:t>requentist</w:t>
+      </w:r>
+      <w:bookmarkEnd w:id="15"/>
+      <w:bookmarkEnd w:id="16"/>
+      <w:bookmarkEnd w:id="17"/>
     </w:p>
     <w:p>
-      <w:pPr>
-        <w:pStyle w:val="Typeface"/>
-      </w:pPr>
-      <w:r>
-        <w:t>artbin, pr(</w:t>
-      </w:r>
-      <w:r>
-        <w:t xml:space="preserve">0.50 </w:t>
-      </w:r>
-      <w:r>
-        <w:t>.5) power(</w:t>
-      </w:r>
-      <w:r>
-        <w:t>0.90</w:t>
-      </w:r>
-      <w:r>
-        <w:t>) margin(-.05) onesided</w:t>
+      <w:r>
+        <w:t>This is the same as the original sample size calculation, but with the two-sided type 1 error rate increased to 20%</w:t>
+      </w:r>
+      <w:r>
+        <w:t>:</w:t>
       </w:r>
     </w:p>
     <w:p>
       <w:pPr>
-        <w:pStyle w:val="Heading3"/>
-      </w:pPr>
+        <w:pStyle w:val="Typeface"/>
+      </w:pPr>
+      <w:r>
+        <w:t>artbin, pr(</w:t>
+      </w:r>
+      <w:r>
+        <w:t>0.50 0.55</w:t>
+      </w:r>
+      <w:r>
+        <w:t>) power(</w:t>
+      </w:r>
+      <w:r>
+        <w:t>0.90</w:t>
+      </w:r>
+      <w:r>
+        <w:t xml:space="preserve">) </w:t>
+      </w:r>
+      <w:r>
+        <w:t>alpha</w:t>
+      </w:r>
+      <w:r>
+        <w:t>(.2)</w:t>
+      </w:r>
     </w:p>
     <w:p>
-      <w:pPr>
-        <w:pStyle w:val="Heading3"/>
-      </w:pPr>
-      <w:bookmarkStart w:id="11" w:name="_Toc237263776"/>
-      <w:bookmarkStart w:id="12" w:name="_Toc237263987"/>
-      <w:r>
-        <w:t>Novel</w:t>
-      </w:r>
-      <w:r>
-        <w:t xml:space="preserve"> f</w:t>
-      </w:r>
-      <w:r>
-        <w:t>requentist</w:t>
-      </w:r>
-      <w:bookmarkEnd w:id="11"/>
-      <w:bookmarkEnd w:id="12"/>
+      <w:r>
+        <w:t>or to 40%:</w:t>
+      </w:r>
     </w:p>
     <w:p>
-      <w:r>
-        <w:t>This is the same as the original sample size calculation, but with the two-sided type 1 error rate increased to 20%</w:t>
-      </w:r>
-      <w:r>
-        <w:t>:</w:t>
+      <w:pPr>
+        <w:pStyle w:val="Typeface"/>
+      </w:pPr>
+      <w:r>
+        <w:t>artbin, pr(</w:t>
+      </w:r>
+      <w:r>
+        <w:t>0.50 0.55</w:t>
+      </w:r>
+      <w:r>
+        <w:t>) power(</w:t>
+      </w:r>
+      <w:r>
+        <w:t>0.90</w:t>
+      </w:r>
+      <w:r>
+        <w:t>) alpha(.4)</w:t>
       </w:r>
     </w:p>
+    <w:p/>
     <w:p>
       <w:pPr>
-        <w:pStyle w:val="Typeface"/>
-      </w:pPr>
-      <w:r>
-        <w:t>artbin, pr(</w:t>
-      </w:r>
-      <w:r>
-        <w:t>0.50 0.55</w:t>
-      </w:r>
-      <w:r>
-        <w:t>) power(</w:t>
-      </w:r>
-      <w:r>
-        <w:t>0.90</w:t>
-      </w:r>
-      <w:r>
-        <w:t xml:space="preserve">) </w:t>
-      </w:r>
-      <w:r>
-        <w:t>alpha</w:t>
-      </w:r>
-      <w:r>
-        <w:t>(.2)</w:t>
-      </w:r>
-    </w:p>
-    <w:p>
-      <w:r>
-        <w:t>or to 40%:</w:t>
-      </w:r>
-    </w:p>
-    <w:p>
-      <w:pPr>
-        <w:pStyle w:val="Typeface"/>
-      </w:pPr>
-      <w:r>
-        <w:t>artbin, pr(</w:t>
-      </w:r>
-      <w:r>
-        <w:t>0.50 0.55</w:t>
-      </w:r>
-      <w:r>
-        <w:t>) power(</w:t>
-      </w:r>
-      <w:r>
-        <w:t>0.90</w:t>
-      </w:r>
-      <w:r>
-        <w:t>) alpha(.4)</w:t>
-      </w:r>
-    </w:p>
-    <w:p>
-      <w:pPr>
         <w:pStyle w:val="Heading3"/>
       </w:pPr>
-    </w:p>
-    <w:p>
-      <w:pPr>
-        <w:pStyle w:val="Heading3"/>
-      </w:pPr>
-      <w:bookmarkStart w:id="13" w:name="_Toc237263777"/>
-      <w:bookmarkStart w:id="14" w:name="_Toc237263988"/>
+      <w:bookmarkStart w:id="18" w:name="_Toc237263777"/>
+      <w:bookmarkStart w:id="19" w:name="_Toc237263988"/>
+      <w:bookmarkStart w:id="20" w:name="_Toc243316022"/>
       <w:r>
         <w:t>Bayesian design (non-informative prior)</w:t>
       </w:r>
-      <w:bookmarkEnd w:id="13"/>
-      <w:bookmarkEnd w:id="14"/>
+      <w:bookmarkEnd w:id="18"/>
+      <w:bookmarkEnd w:id="19"/>
+      <w:bookmarkEnd w:id="20"/>
     </w:p>
     <w:p>
       <w:r>
@@ -582,7 +1302,7 @@
       <w:r>
         <w:t xml:space="preserve">available at </w:t>
       </w:r>
-      <w:hyperlink r:id="rId9" w:history="1">
+      <w:hyperlink r:id="rId10" w:history="1">
         <w:r>
           <w:rPr>
             <w:rStyle w:val="Hyperlink"/>
@@ -869,7 +1589,6 @@
         <w:pStyle w:val="Typeface"/>
       </w:pPr>
       <w:r>
-        <w:lastRenderedPageBreak/>
         <w:t>bayespower, n1(</w:t>
       </w:r>
       <w:r>
@@ -996,22 +1715,20 @@
         <w:t xml:space="preserve">.80) </w:t>
       </w:r>
     </w:p>
+    <w:p/>
     <w:p>
       <w:pPr>
         <w:pStyle w:val="Heading3"/>
       </w:pPr>
-    </w:p>
-    <w:p>
-      <w:pPr>
-        <w:pStyle w:val="Heading3"/>
-      </w:pPr>
-      <w:bookmarkStart w:id="15" w:name="_Toc237263778"/>
-      <w:bookmarkStart w:id="16" w:name="_Toc237263989"/>
+      <w:bookmarkStart w:id="21" w:name="_Toc237263778"/>
+      <w:bookmarkStart w:id="22" w:name="_Toc237263989"/>
+      <w:bookmarkStart w:id="23" w:name="_Toc243316023"/>
       <w:r>
         <w:t>Decision-based approach</w:t>
       </w:r>
-      <w:bookmarkEnd w:id="15"/>
-      <w:bookmarkEnd w:id="16"/>
+      <w:bookmarkEnd w:id="21"/>
+      <w:bookmarkEnd w:id="22"/>
+      <w:bookmarkEnd w:id="23"/>
     </w:p>
     <w:p>
       <w:pPr>
@@ -2272,7 +2989,6 @@
         <w:ind w:left="357" w:hanging="357"/>
       </w:pPr>
       <w:r>
-        <w:lastRenderedPageBreak/>
         <w:t xml:space="preserve">Hence </w:t>
       </w:r>
       <w:r>
@@ -2342,16 +3058,18 @@
     </w:p>
     <w:p>
       <w:pPr>
-        <w:pStyle w:val="Heading1"/>
-      </w:pPr>
-      <w:bookmarkStart w:id="17" w:name="_Toc237263990"/>
+        <w:pStyle w:val="Heading2"/>
+      </w:pPr>
+      <w:bookmarkStart w:id="24" w:name="_Toc237263990"/>
+      <w:bookmarkStart w:id="25" w:name="_Toc243316024"/>
       <w:r>
         <w:t>Reference</w:t>
       </w:r>
       <w:r>
         <w:t>s</w:t>
       </w:r>
-      <w:bookmarkEnd w:id="17"/>
+      <w:bookmarkEnd w:id="24"/>
+      <w:bookmarkEnd w:id="25"/>
     </w:p>
     <w:p>
       <w:pPr>
@@ -2409,7 +3127,7 @@
     <w:p>
       <w:pPr>
         <w:sectPr>
-          <w:footerReference w:type="default" r:id="rId10"/>
+          <w:footerReference w:type="default" r:id="rId11"/>
           <w:pgSz w:w="11906" w:h="16838" w:code="9"/>
           <w:pgMar w:top="1440" w:right="1440" w:bottom="1440" w:left="1440" w:header="709" w:footer="709" w:gutter="0"/>
           <w:cols w:space="708"/>
@@ -2422,42 +3140,37 @@
     </w:p>
     <w:p>
       <w:pPr>
-        <w:pStyle w:val="Caption"/>
-      </w:pPr>
-      <w:bookmarkStart w:id="18" w:name="_Ref236047323"/>
-      <w:bookmarkStart w:id="19" w:name="_Toc237263991"/>
+        <w:pStyle w:val="Heading2"/>
+      </w:pPr>
+      <w:bookmarkStart w:id="26" w:name="_Ref236047323"/>
+      <w:bookmarkStart w:id="27" w:name="_Toc243316025"/>
+      <w:bookmarkStart w:id="28" w:name="_Toc237263991"/>
       <w:r>
         <w:rPr>
-          <w:b/>
           <w:bCs/>
         </w:rPr>
-        <w:lastRenderedPageBreak/>
         <w:t xml:space="preserve">Table </w:t>
       </w:r>
       <w:r>
         <w:rPr>
-          <w:b/>
           <w:bCs/>
         </w:rPr>
         <w:fldChar w:fldCharType="begin"/>
       </w:r>
       <w:r>
         <w:rPr>
-          <w:b/>
           <w:bCs/>
         </w:rPr>
         <w:instrText xml:space="preserve"> SEQ Table \* ARABIC </w:instrText>
       </w:r>
       <w:r>
         <w:rPr>
-          <w:b/>
           <w:bCs/>
         </w:rPr>
         <w:fldChar w:fldCharType="separate"/>
       </w:r>
       <w:r>
         <w:rPr>
-          <w:b/>
           <w:bCs/>
           <w:noProof/>
         </w:rPr>
@@ -2465,14 +3178,13 @@
       </w:r>
       <w:r>
         <w:rPr>
-          <w:b/>
           <w:bCs/>
           <w:noProof/>
         </w:rPr>
         <w:fldChar w:fldCharType="end"/>
       </w:r>
-      <w:bookmarkEnd w:id="3"/>
-      <w:bookmarkEnd w:id="18"/>
+      <w:bookmarkEnd w:id="4"/>
+      <w:bookmarkEnd w:id="26"/>
       <w:r>
         <w:t xml:space="preserve">. Possible trial designs for </w:t>
       </w:r>
@@ -2481,7 +3193,7 @@
       </w:r>
       <w:r>
         <w:rPr>
-          <w:rFonts w:eastAsia="Times New Roman" w:cstheme="minorHAnsi"/>
+          <w:rFonts w:eastAsia="Times New Roman"/>
           <w:color w:val="000000"/>
           <w:lang w:eastAsia="en-GB"/>
         </w:rPr>
@@ -2501,7 +3213,7 @@
       </w:r>
       <w:r>
         <w:rPr>
-          <w:rFonts w:eastAsia="Times New Roman" w:cstheme="minorHAnsi"/>
+          <w:rFonts w:eastAsia="Times New Roman"/>
           <w:color w:val="000000"/>
           <w:lang w:eastAsia="en-GB"/>
         </w:rPr>
@@ -2526,7 +3238,16 @@
         <w:t>operable squamous oesophageal cancer</w:t>
       </w:r>
       <w:r>
-        <w:t>. Non-inferiority calculation a</w:t>
+        <w:t>.</w:t>
+      </w:r>
+      <w:bookmarkEnd w:id="27"/>
+      <w:r>
+        <w:t xml:space="preserve"> </w:t>
+      </w:r>
+    </w:p>
+    <w:p>
+      <w:r>
+        <w:t>Non-inferiority calculation a</w:t>
       </w:r>
       <w:r>
         <w:t xml:space="preserve">ssumes </w:t>
@@ -2576,7 +3297,7 @@
       <w:r>
         <w:t>the other.</w:t>
       </w:r>
-      <w:bookmarkEnd w:id="19"/>
+      <w:bookmarkEnd w:id="28"/>
     </w:p>
     <w:tbl>
       <w:tblPr>
@@ -3459,11 +4180,11 @@
       <w:r>
         <w:t>should be considered as reference intervention</w:t>
       </w:r>
-      <w:bookmarkStart w:id="20" w:name="_Ref169885346"/>
+      <w:bookmarkStart w:id="29" w:name="_Ref169885346"/>
       <w:r>
         <w:t>.</w:t>
       </w:r>
-      <w:bookmarkEnd w:id="20"/>
+      <w:bookmarkEnd w:id="29"/>
     </w:p>
     <w:sectPr>
       <w:pgSz w:w="16838" w:h="11906" w:orient="landscape" w:code="9"/>
@@ -6914,6 +7635,29 @@
       <w:ind w:left="480"/>
     </w:pPr>
   </w:style>
+  <w:style w:type="paragraph" w:styleId="TOCHeading">
+    <w:name w:val="TOC Heading"/>
+    <w:basedOn w:val="Heading1"/>
+    <w:next w:val="Normal"/>
+    <w:uiPriority w:val="39"/>
+    <w:unhideWhenUsed/>
+    <w:qFormat/>
+    <w:rsid w:val="0035619A"/>
+    <w:pPr>
+      <w:spacing w:before="120" w:after="120"/>
+      <w:outlineLvl w:val="9"/>
+    </w:pPr>
+    <w:rPr>
+      <w:rFonts w:asciiTheme="majorHAnsi" w:hAnsiTheme="majorHAnsi" w:cstheme="majorBidi"/>
+      <w:bCs/>
+      <w:i/>
+      <w:iCs/>
+      <w:color w:val="2F5496" w:themeColor="accent1" w:themeShade="BF"/>
+      <w:sz w:val="26"/>
+      <w:szCs w:val="26"/>
+      <w:lang w:val="en-US"/>
+    </w:rPr>
+  </w:style>
 </w:styles>
 </file>
 

</xml_diff>